<commit_message>
Replace HTML pages with a React front end
The project brief and NFR-07 ask for JavaScript + React + HTML5 on the front
end; the prototype had plain HTML pages served by Spring Boot instead.

- frontend/: React 18 + Vite + React Router app with the same pages as before
  (home, sign-up, sign-in, applicant, staff with one component per tab)
- the back end is now a pure REST API: sign-in and sign-out answer with JSON,
  and SpaController serves the React app for its page addresses
- Maven builds the React app (frontend-maven-plugin downloads Node.js), so
  ./mvnw spring-boot:run still starts everything with one command
- README and the functional test plan describe the new front end
</commit_message>
<xml_diff>
--- a/docs/phase-2/functional-test-plan.docx
+++ b/docs/phase-2/functional-test-plan.docx
@@ -131,7 +131,7 @@
         <w:t xml:space="preserve">Manual: </w:t>
       </w:r>
       <w:r>
-        <w:t>a person follows the steps in a browser. This is used for what only the screen shows, such as a disabled button, a confirmation dialog or typed values staying in a form after an error.</w:t>
+        <w:t>a person follows the steps in the React app in a browser. This is used for what only the screen shows, such as a disabled button, a confirmation dialog or typed values staying in a form after an error.</w:t>
       </w:r>
     </w:p>
     <w:p>
@@ -170,7 +170,7 @@
         <w:t xml:space="preserve">Software. </w:t>
       </w:r>
       <w:r>
-        <w:t>Java 17 or newer, Spring Boot 3.5, MySQL 8 (H2 in-memory database for the automated tests), latest Chrome, Firefox and Edge for manual tests.</w:t>
+        <w:t>React front end (JavaScript, HTML5), Java 17 or newer with Spring Boot 3.5, MySQL 8 (H2 in-memory database for quick automated runs), latest Chrome, Firefox and Edge for manual tests.</w:t>
       </w:r>
     </w:p>
     <w:p>
@@ -11788,7 +11788,7 @@
         <w:pStyle w:val="a0"/>
       </w:pPr>
       <w:r>
-        <w:t>The plan has 75 test cases: 62 automated, 8 automated with an extra check by hand, and 5 manual. The automated part is 80 JUnit tests in the GitHub repository (src/test/java); some tests cover more than one test case, and some test cases are checked by several tests. On October 17, 2026 all 80 passed against the initial prototype. The manual cases will be run in Phase III, when the screens are complete.</w:t>
+        <w:t>The plan has 75 test cases: 62 automated, 8 automated with an extra check by hand, and 5 manual. The automated part is 80 JUnit tests in the GitHub repository (src/test/java); some tests cover more than one test case, and some test cases are checked by several tests. On October 18, 2026 all 80 passed against the initial prototype, both on H2 and on a real MySQL 8 server. The manual cases will be run on the React front end in Phase III, when the screens are complete.</w:t>
       </w:r>
     </w:p>
     <w:sectPr>

</xml_diff>